<commit_message>
Resume: Associate Security Analyst @ Airbus (MNC)
</commit_message>
<xml_diff>
--- a/resumes/Resume_Associate_Security_Analyst_Airbus__MNC_.docx
+++ b/resumes/Resume_Associate_Security_Analyst_Airbus__MNC_.docx
@@ -562,7 +562,7 @@
           <w:sz w:val="19"/>
           <w:szCs w:val="19"/>
         </w:rPr>
-        <w:t>Deployed Splunk SIEM with spl correlation (detection engineering) searches for brute-force detection (index=* failed | stats count by src_ip), lateral movement, and privilege escalation; mapped TTPs to mitre att&amp;ck (TTP mapping) (T1110, T1078, T1059) and wrote PICERL incident report.</w:t>
+        <w:t>Deployed Splunk SIEM with SPL correlation (detection engineering) searches for brute-force detection (index=* failed | stats count by src_ip), lateral movement, and privilege escalation; mapped TTPs to MITRE ATT&amp;CK (TTP mapping) (T1110, T1078, T1059) and wrote PICERL incident report.</w:t>
       </w:r>
     </w:p>
     <w:p>
@@ -581,7 +581,7 @@
           <w:sz w:val="19"/>
           <w:szCs w:val="19"/>
         </w:rPr>
-        <w:t>Built automated soar (security orchestration and automation)-style detection pipeline: Python script ingests Splunk alerts, runs ioc enrichment (threat intelligence) via VirusTotal API, and dispatches Telegram notifications with severity classification — reducing mean time to triage by automating repetitive L1 tasks.</w:t>
+        <w:t>Built automated SOAR (security orchestration and automation)-style detection pipeline: Python script ingests Splunk alerts, runs IOC enrichment (threat intelligence) via VirusTotal API, and dispatches Telegram notifications with severity classification — reducing mean time to triage by automating repetitive L1 tasks.</w:t>
       </w:r>
     </w:p>
     <w:p>
@@ -600,7 +600,7 @@
           <w:sz w:val="19"/>
           <w:szCs w:val="19"/>
         </w:rPr>
-        <w:t>Converted detection logic to sigma rules (detection-as-code) (vendor-neutral format used by enterprise SOCs); performed TCP/IP analysis in Wireshark to detect SYN scans, DNS tunnelling, and plaintext credential exposure on unencrypted sessions.</w:t>
+        <w:t>Converted detection logic to Sigma rules (detection-as-code) (vendor-neutral format used by enterprise SOCs); performed TCP/IP analysis in Wireshark to detect SYN scans, DNS tunnelling, and plaintext credential exposure on unencrypted sessions.</w:t>
       </w:r>
       <w:proofErr w:type="spellStart"/>
       <w:r>
@@ -736,7 +736,7 @@
           <w:sz w:val="19"/>
           <w:szCs w:val="19"/>
         </w:rPr>
-        <w:t>Deployed Telegram bot interface enabling analysts to submit URLs for live ioc enrichment (threat intelligence); supports bulk CSV input/output for incident response workflows and includes osint enrichment (open-source intelligence) via theHarvester for domain profiling.</w:t>
+        <w:t>Deployed Telegram bot interface enabling analysts to submit URLs for live IOC enrichment (threat intelligence); supports bulk CSV input/output for incident response workflows and includes OSINT enrichment (open-source intelligence) via theHarvester for domain profiling.</w:t>
       </w:r>
     </w:p>
     <w:p>
@@ -881,7 +881,7 @@
           <w:sz w:val="19"/>
           <w:szCs w:val="19"/>
         </w:rPr>
-        <w:t>Python, Bash (basic), regular expressions, security, security</w:t>
+        <w:t>Python, Bash (basic), regular expressions, security</w:t>
       </w:r>
     </w:p>
     <w:p>

</xml_diff>